<commit_message>
better parser & g4d file
</commit_message>
<xml_diff>
--- a/test/doc1.docx
+++ b/test/doc1.docx
@@ -233,6 +233,26 @@
           <w:sz w:val="52"/>
           <w:szCs w:val="52"/>
         </w:rPr>
+      </w:r>
+    </w:p>
+    <w:p>
+      <w:pPr>
+        <w:pStyle w:val="Normal"/>
+        <w:bidi w:val="0"/>
+        <w:jc w:val="start"/>
+        <w:rPr>
+          <w:rFonts w:eastAsia="Noto Serif CJK SC Black"/>
+          <w:sz w:val="52"/>
+          <w:szCs w:val="52"/>
+        </w:rPr>
+      </w:pPr>
+      <w:r>
+        <w:rPr>
+          <w:rFonts w:eastAsia="Noto Serif CJK SC Black"/>
+          <w:sz w:val="52"/>
+          <w:szCs w:val="52"/>
+        </w:rPr>
+        <w:t>space commit</w:t>
       </w:r>
       <w:r>
         <w:br w:type="page"/>
@@ -319,7 +339,7 @@
       <w:spacing w:before="240" w:after="120"/>
     </w:pPr>
     <w:rPr>
-      <w:rFonts w:ascii="Liberation Sans" w:hAnsi="Liberation Sans" w:eastAsia="Noto Sans CJK SC" w:cs="Noto Sans Devanagari"/>
+      <w:rFonts w:ascii="Liberation Sans" w:hAnsi="Liberation Sans" w:eastAsia="Noto Sans CJK SC" w:cs="Noto Sans"/>
       <w:sz w:val="28"/>
       <w:szCs w:val="28"/>
     </w:rPr>
@@ -364,7 +384,7 @@
       <w:suppressLineNumbers/>
     </w:pPr>
     <w:rPr>
-      <w:rFonts w:cs="Noto Sans Devanagari"/>
+      <w:rFonts w:cs="Noto Sans"/>
     </w:rPr>
   </w:style>
   <w:style w:type="paragraph" w:styleId="user">
@@ -377,7 +397,7 @@
       <w:spacing w:before="240" w:after="120"/>
     </w:pPr>
     <w:rPr>
-      <w:rFonts w:ascii="Liberation Sans" w:hAnsi="Liberation Sans" w:eastAsia="Noto Sans CJK SC" w:cs="Noto Sans"/>
+      <w:rFonts w:ascii="Liberation Sans" w:hAnsi="Liberation Sans" w:eastAsia="Noto Sans CJK SC" w:cs="Noto Sans Devanagari"/>
       <w:sz w:val="28"/>
       <w:szCs w:val="28"/>
     </w:rPr>
@@ -390,7 +410,7 @@
       <w:suppressLineNumbers/>
     </w:pPr>
     <w:rPr>
-      <w:rFonts w:cs="Noto Sans"/>
+      <w:rFonts w:cs="Noto Sans Devanagari"/>
     </w:rPr>
   </w:style>
 </w:styles>

</xml_diff>